<commit_message>
Use LinkedIn icon on website
</commit_message>
<xml_diff>
--- a/Eric_Lane_AI_Automation_Consultant_Resume.docx
+++ b/Eric_Lane_AI_Automation_Consultant_Resume.docx
@@ -126,13 +126,13 @@
       <w:r>
         <w:rPr>
           <w:rFonts w:ascii="Arial" w:hAnsi="Arial" w:cs="Arial"/>
-          <w:sz w:val="26"/>
-          <w:sz-cs w:val="26"/>
-          <w:u w:val="single"/>
-          <w:spacing w:val="0"/>
-          <w:color w:val="0000E9"/>
-        </w:rPr>
-        <w:t xml:space="preserve">LinkedIn</w:t>
+          <w:sz w:val="22"/>
+          <w:sz-cs w:val="22"/>
+          <w:b/>
+          <w:spacing w:val="0"/>
+          <w:color w:val="FFFFFF"/>
+        </w:rPr>
+        <w:t xml:space="preserve">in</w:t>
       </w:r>
       <w:r>
         <w:rPr>
@@ -2017,24 +2017,102 @@
       <w:r>
         <w:rPr>
           <w:rFonts w:ascii="Arial" w:hAnsi="Arial" w:cs="Arial"/>
+          <w:sz w:val="26"/>
+          <w:sz-cs w:val="26"/>
+          <w:b/>
+          <w:spacing w:val="0"/>
+          <w:color w:val="FFFFFF"/>
+        </w:rPr>
+        <w:t xml:space="preserve">in</w:t>
+      </w:r>
+      <w:r>
+        <w:rPr>
+          <w:rFonts w:ascii="Arial" w:hAnsi="Arial" w:cs="Arial"/>
+          <w:sz w:val="27"/>
+          <w:sz-cs w:val="27"/>
+          <w:spacing w:val="0"/>
+          <w:color w:val="12181F"/>
+        </w:rPr>
+        <w:t xml:space="preserve"> </w:t>
+      </w:r>
+      <w:r>
+        <w:rPr>
+          <w:rFonts w:ascii="Arial" w:hAnsi="Arial" w:cs="Arial"/>
           <w:sz w:val="25"/>
           <w:sz-cs w:val="25"/>
           <w:b/>
           <w:spacing w:val="0"/>
           <w:color w:val="0D322E"/>
         </w:rPr>
-        <w:t xml:space="preserve">LinkedIn</w:t>
-      </w:r>
-      <w:r>
-        <w:rPr>
-          <w:rFonts w:ascii="Arial" w:hAnsi="Arial" w:cs="Arial"/>
-          <w:sz w:val="27"/>
-          <w:sz-cs w:val="27"/>
-          <w:spacing w:val="0"/>
-          <w:color w:val="12181F"/>
-        </w:rPr>
-        <w:t xml:space="preserve"> </w:t>
-      </w:r>
+        <w:t xml:space="preserve">Email Eric</w:t>
+      </w:r>
+      <w:r>
+        <w:rPr>
+          <w:rFonts w:ascii="Arial" w:hAnsi="Arial" w:cs="Arial"/>
+          <w:sz w:val="27"/>
+          <w:sz-cs w:val="27"/>
+          <w:spacing w:val="0"/>
+          <w:color w:val="12181F"/>
+        </w:rPr>
+        <w:t xml:space="preserve"/>
+      </w:r>
+    </w:p>
+    <w:p>
+      <w:pPr>
+        <w:jc w:val="center"/>
+      </w:pPr>
+      <w:r>
+        <w:rPr>
+          <w:rFonts w:ascii="Arial" w:hAnsi="Arial" w:cs="Arial"/>
+          <w:sz w:val="34"/>
+          <w:sz-cs w:val="34"/>
+          <w:b/>
+          <w:spacing w:val="0"/>
+          <w:color w:val="0D322E"/>
+        </w:rPr>
+        <w:t xml:space="preserve">Review-ready assets</w:t>
+      </w:r>
+      <w:r>
+        <w:rPr>
+          <w:rFonts w:ascii="Arial" w:hAnsi="Arial" w:cs="Arial"/>
+          <w:sz w:val="34"/>
+          <w:sz-cs w:val="34"/>
+          <w:b/>
+          <w:spacing w:val="0"/>
+          <w:color w:val="0D322E"/>
+        </w:rPr>
+        <w:t xml:space="preserve"/>
+      </w:r>
+    </w:p>
+    <w:p>
+      <w:pPr>
+        <w:jc w:val="center"/>
+      </w:pPr>
+      <w:r>
+        <w:rPr>
+          <w:rFonts w:ascii="Arial" w:hAnsi="Arial" w:cs="Arial"/>
+          <w:sz w:val="24"/>
+          <w:sz-cs w:val="24"/>
+          <w:spacing w:val="0"/>
+          <w:color w:val="495260"/>
+        </w:rPr>
+        <w:t xml:space="preserve">Use the polished resume for humans and the ATS copy for application systems.</w:t>
+      </w:r>
+      <w:r>
+        <w:rPr>
+          <w:rFonts w:ascii="Arial" w:hAnsi="Arial" w:cs="Arial"/>
+          <w:sz w:val="24"/>
+          <w:sz-cs w:val="24"/>
+          <w:spacing w:val="0"/>
+          <w:color w:val="495260"/>
+        </w:rPr>
+        <w:t xml:space="preserve"/>
+      </w:r>
+    </w:p>
+    <w:p>
+      <w:pPr>
+        <w:jc w:val="center"/>
+      </w:pPr>
       <w:r>
         <w:rPr>
           <w:rFonts w:ascii="Arial" w:hAnsi="Arial" w:cs="Arial"/>
@@ -2042,140 +2120,63 @@
           <w:sz-cs w:val="25"/>
           <w:b/>
           <w:spacing w:val="0"/>
-          <w:color w:val="0D322E"/>
-        </w:rPr>
-        <w:t xml:space="preserve">Email Eric</w:t>
-      </w:r>
-      <w:r>
-        <w:rPr>
-          <w:rFonts w:ascii="Arial" w:hAnsi="Arial" w:cs="Arial"/>
-          <w:sz w:val="27"/>
-          <w:sz-cs w:val="27"/>
-          <w:spacing w:val="0"/>
-          <w:color w:val="12181F"/>
-        </w:rPr>
-        <w:t xml:space="preserve"/>
-      </w:r>
-    </w:p>
-    <w:p>
-      <w:pPr>
-        <w:jc w:val="center"/>
-      </w:pPr>
-      <w:r>
-        <w:rPr>
-          <w:rFonts w:ascii="Arial" w:hAnsi="Arial" w:cs="Arial"/>
-          <w:sz w:val="34"/>
-          <w:sz-cs w:val="34"/>
-          <w:b/>
-          <w:spacing w:val="0"/>
-          <w:color w:val="0D322E"/>
-        </w:rPr>
-        <w:t xml:space="preserve">Review-ready assets</w:t>
-      </w:r>
-      <w:r>
-        <w:rPr>
-          <w:rFonts w:ascii="Arial" w:hAnsi="Arial" w:cs="Arial"/>
-          <w:sz w:val="34"/>
-          <w:sz-cs w:val="34"/>
-          <w:b/>
-          <w:spacing w:val="0"/>
-          <w:color w:val="0D322E"/>
-        </w:rPr>
-        <w:t xml:space="preserve"/>
-      </w:r>
-    </w:p>
-    <w:p>
-      <w:pPr>
-        <w:jc w:val="center"/>
-      </w:pPr>
+          <w:color w:val="FFFFFF"/>
+        </w:rPr>
+        <w:t xml:space="preserve">Resume</w:t>
+      </w:r>
+      <w:r>
+        <w:rPr>
+          <w:rFonts w:ascii="Arial" w:hAnsi="Arial" w:cs="Arial"/>
+          <w:sz w:val="27"/>
+          <w:sz-cs w:val="27"/>
+          <w:spacing w:val="0"/>
+          <w:color w:val="12181F"/>
+        </w:rPr>
+        <w:t xml:space="preserve"> </w:t>
+      </w:r>
+      <w:r>
+        <w:rPr>
+          <w:rFonts w:ascii="Arial" w:hAnsi="Arial" w:cs="Arial"/>
+          <w:sz w:val="25"/>
+          <w:sz-cs w:val="25"/>
+          <w:b/>
+          <w:spacing w:val="0"/>
+          <w:color w:val="0D322E"/>
+        </w:rPr>
+        <w:t xml:space="preserve">ATS Copy</w:t>
+      </w:r>
       <w:r>
         <w:rPr>
           <w:rFonts w:ascii="Arial" w:hAnsi="Arial" w:cs="Arial"/>
           <w:sz w:val="24"/>
           <w:sz-cs w:val="24"/>
-          <w:spacing w:val="0"/>
-          <w:color w:val="495260"/>
-        </w:rPr>
-        <w:t xml:space="preserve">Use the polished resume for humans and the ATS copy for application systems.</w:t>
-      </w:r>
+          <w:b/>
+          <w:spacing w:val="0"/>
+          <w:color w:val="495260"/>
+        </w:rPr>
+        <w:t xml:space="preserve"/>
+      </w:r>
+    </w:p>
+    <w:p>
+      <w:pPr>
+        <w:jc w:val="center"/>
+      </w:pPr>
       <w:r>
         <w:rPr>
           <w:rFonts w:ascii="Arial" w:hAnsi="Arial" w:cs="Arial"/>
           <w:sz w:val="24"/>
           <w:sz-cs w:val="24"/>
-          <w:spacing w:val="0"/>
-          <w:color w:val="495260"/>
-        </w:rPr>
-        <w:t xml:space="preserve"/>
+          <w:b/>
+          <w:spacing w:val="0"/>
+          <w:color w:val="495260"/>
+        </w:rPr>
+        <w:t xml:space="preserve">in</w:t>
       </w:r>
     </w:p>
     <w:p>
       <w:pPr>
         <w:jc w:val="center"/>
       </w:pPr>
-      <w:r>
-        <w:rPr>
-          <w:rFonts w:ascii="Arial" w:hAnsi="Arial" w:cs="Arial"/>
-          <w:sz w:val="25"/>
-          <w:sz-cs w:val="25"/>
-          <w:b/>
-          <w:spacing w:val="0"/>
-          <w:color w:val="FFFFFF"/>
-        </w:rPr>
-        <w:t xml:space="preserve">Resume</w:t>
-      </w:r>
-      <w:r>
-        <w:rPr>
-          <w:rFonts w:ascii="Arial" w:hAnsi="Arial" w:cs="Arial"/>
-          <w:sz w:val="27"/>
-          <w:sz-cs w:val="27"/>
-          <w:spacing w:val="0"/>
-          <w:color w:val="12181F"/>
-        </w:rPr>
-        <w:t xml:space="preserve"> </w:t>
-      </w:r>
-      <w:r>
-        <w:rPr>
-          <w:rFonts w:ascii="Arial" w:hAnsi="Arial" w:cs="Arial"/>
-          <w:sz w:val="25"/>
-          <w:sz-cs w:val="25"/>
-          <w:b/>
-          <w:spacing w:val="0"/>
-          <w:color w:val="0D322E"/>
-        </w:rPr>
-        <w:t xml:space="preserve">ATS Copy</w:t>
-      </w:r>
-      <w:r>
-        <w:rPr>
-          <w:rFonts w:ascii="Arial" w:hAnsi="Arial" w:cs="Arial"/>
-          <w:sz w:val="27"/>
-          <w:sz-cs w:val="27"/>
-          <w:spacing w:val="0"/>
-          <w:color w:val="12181F"/>
-        </w:rPr>
-        <w:t xml:space="preserve"> </w:t>
-      </w:r>
-      <w:r>
-        <w:rPr>
-          <w:rFonts w:ascii="Arial" w:hAnsi="Arial" w:cs="Arial"/>
-          <w:sz w:val="25"/>
-          <w:sz-cs w:val="25"/>
-          <w:b/>
-          <w:spacing w:val="0"/>
-          <w:color w:val="0D322E"/>
-        </w:rPr>
-        <w:t xml:space="preserve">LinkedIn</w:t>
-      </w:r>
-      <w:r>
-        <w:rPr>
-          <w:rFonts w:ascii="Arial" w:hAnsi="Arial" w:cs="Arial"/>
-          <w:sz w:val="27"/>
-          <w:sz-cs w:val="27"/>
-          <w:spacing w:val="0"/>
-          <w:color w:val="12181F"/>
-        </w:rPr>
-        <w:t xml:space="preserve"> </w:t>
-      </w:r>
       <w:r>
         <w:rPr>
           <w:rFonts w:ascii="Arial" w:hAnsi="Arial" w:cs="Arial"/>

</xml_diff>

<commit_message>
Refine roles and education
</commit_message>
<xml_diff>
--- a/Eric_Lane_AI_Automation_Consultant_Resume.docx
+++ b/Eric_Lane_AI_Automation_Consultant_Resume.docx
@@ -1801,7 +1801,7 @@
           <w:spacing w:val="0"/>
           <w:color w:val="495260"/>
         </w:rPr>
-        <w:t xml:space="preserve">M.S. in Information Systems</w:t>
+        <w:t xml:space="preserve">M.S. in Information Systems, specialization in Enterprise Application Development</w:t>
       </w:r>
       <w:r>
         <w:rPr>
@@ -1898,54 +1898,6 @@
           <w:color w:val="495260"/>
         </w:rPr>
         <w:t xml:space="preserve">Associate Degree in Cyber and Network Security</w:t>
-      </w:r>
-      <w:r>
-        <w:rPr>
-          <w:rFonts w:ascii="Arial" w:hAnsi="Arial" w:cs="Arial"/>
-          <w:sz w:val="24"/>
-          <w:sz-cs w:val="24"/>
-          <w:spacing w:val="0"/>
-          <w:color w:val="495260"/>
-        </w:rPr>
-        <w:t xml:space="preserve"/>
-      </w:r>
-    </w:p>
-    <w:p>
-      <w:pPr/>
-      <w:r>
-        <w:rPr>
-          <w:rFonts w:ascii="Arial" w:hAnsi="Arial" w:cs="Arial"/>
-          <w:sz w:val="26"/>
-          <w:sz-cs w:val="26"/>
-          <w:b/>
-          <w:spacing w:val="0"/>
-          <w:color w:val="12181F"/>
-        </w:rPr>
-        <w:t xml:space="preserve">Enterprise Application Development</w:t>
-      </w:r>
-      <w:r>
-        <w:rPr>
-          <w:rFonts w:ascii="Arial" w:hAnsi="Arial" w:cs="Arial"/>
-          <w:sz w:val="26"/>
-          <w:sz-cs w:val="26"/>
-          <w:b/>
-          <w:spacing w:val="0"/>
-          <w:color w:val="12181F"/>
-        </w:rPr>
-        <w:t xml:space="preserve"/>
-      </w:r>
-    </w:p>
-    <w:p>
-      <w:pPr/>
-      <w:r>
-        <w:rPr>
-          <w:rFonts w:ascii="Arial" w:hAnsi="Arial" w:cs="Arial"/>
-          <w:sz w:val="24"/>
-          <w:sz-cs w:val="24"/>
-          <w:spacing w:val="0"/>
-          <w:color w:val="495260"/>
-        </w:rPr>
-        <w:t xml:space="preserve">Education and training program</w:t>
       </w:r>
       <w:r>
         <w:rPr>

</xml_diff>

<commit_message>
Broaden automation positioning and add portfolio fallback
</commit_message>
<xml_diff>
--- a/Eric_Lane_AI_Automation_Consultant_Resume.docx
+++ b/Eric_Lane_AI_Automation_Consultant_Resume.docx
@@ -38,7 +38,7 @@
           <w:spacing w:val="0"/>
           <w:color w:val="125950"/>
         </w:rPr>
-        <w:t xml:space="preserve">Digital Transformation &amp; AI Automation Leader | Healthcare Operations | UiPath, OCR, SQL, Python</w:t>
+        <w:t xml:space="preserve">Digital Transformation &amp; AI Automation Leader | Operations Automation | UiPath, OCR, SQL, Python</w:t>
       </w:r>
       <w:r>
         <w:rPr>
@@ -181,7 +181,7 @@
           <w:spacing w:val="0"/>
           <w:color w:val="12181F"/>
         </w:rPr>
-        <w:t xml:space="preserve">Digital transformation and AI automation leader with healthcare operations experience building automation functions, scaling teams, and modernizing manual workflows through UiPath, OCR, SQL, Python, VBA, and process redesign. Combines consultant-level discovery, roadmap thinking, and stakeholder management with hands-on ability to build code, implement solutions, and drive adoption. Proven record creating operating models, enablement resources, and governance practices that improve adoption, reduce inventory, eliminate manual work, and exceed financial targets.</w:t>
+        <w:t xml:space="preserve">Digital transformation and AI automation leader with operations experience building automation functions, scaling teams, and modernizing manual workflows through UiPath, OCR, SQL, Python, VBA, and process redesign. Combines consultant-level discovery, roadmap thinking, and stakeholder management with hands-on ability to build code, implement solutions, and drive adoption. Proven record creating operating models, enablement resources, and governance practices that improve adoption, reduce inventory, eliminate manual work, and exceed financial targets.</w:t>
       </w:r>
       <w:r>
         <w:rPr>
@@ -682,7 +682,7 @@
           <w:spacing w:val="0"/>
           <w:color w:val="12181F"/>
         </w:rPr>
-        <w:t xml:space="preserve">Created a new AI and automation consulting function to identify, prioritize, document, and deliver automation opportunities across healthcare operations.</w:t>
+        <w:t xml:space="preserve">Created a new AI and automation consulting function to identify, prioritize, document, and deliver automation opportunities across enterprise operations.</w:t>
       </w:r>
       <w:r>
         <w:rPr>
@@ -799,7 +799,7 @@
           <w:spacing w:val="0"/>
           <w:color w:val="12181F"/>
         </w:rPr>
-        <w:t xml:space="preserve">Authored a healthcare operations automation consulting playbook defining intake, discovery, value calculation, prioritization, LOE templates, governance gates, launch readiness, retrospectives, and continuous improvement standards.</w:t>
+        <w:t xml:space="preserve">Authored an operations automation consulting playbook defining intake, discovery, value calculation, prioritization, LOE templates, governance gates, launch readiness, retrospectives, and continuous improvement standards.</w:t>
       </w:r>
       <w:r>
         <w:rPr>
@@ -838,7 +838,7 @@
           <w:spacing w:val="0"/>
           <w:color w:val="12181F"/>
         </w:rPr>
-        <w:t xml:space="preserve">Built automation strategy and delivery structure for healthcare operations, prioritizing high-value workflows across claims, disputes, reporting, and team productivity.</w:t>
+        <w:t xml:space="preserve">Built automation strategy and delivery structure for high-volume regulated operations, prioritizing high-value workflows across claims, disputes, reporting, and team productivity.</w:t>
       </w:r>
       <w:r>
         <w:rPr>
@@ -2037,7 +2037,7 @@
           <w:spacing w:val="0"/>
           <w:color w:val="495260"/>
         </w:rPr>
-        <w:t xml:space="preserve">This page extends the resume with project stories, business problems solved, and recruiter-ready proof points for transformation strategy, AI automation, UiPath enablement, macros, reporting, OCR, governance, and healthcare operations modernization.</w:t>
+        <w:t xml:space="preserve">This page extends the resume with project stories, business problems solved, and recruiter-ready proof points for transformation strategy, AI automation, UiPath enablement, macros, reporting, OCR, governance, and operations modernization.</w:t>
       </w:r>
       <w:r>
         <w:rPr>
@@ -2373,7 +2373,7 @@
           <w:spacing w:val="0"/>
           <w:color w:val="495260"/>
         </w:rPr>
-        <w:t xml:space="preserve">I understand healthcare operations, inventory pressure, team execution, quality expectations, and the daily friction behind manual work.</w:t>
+        <w:t xml:space="preserve">I understand operations, inventory pressure, team execution, quality expectations, and the daily friction behind manual work.</w:t>
       </w:r>
       <w:r>
         <w:rPr>
@@ -3101,6 +3101,27 @@
           <w:spacing w:val="0"/>
           <w:color w:val="0D322E"/>
         </w:rPr>
+        <w:t xml:space="preserve">Operations Automation Consultant</w:t>
+      </w:r>
+      <w:r>
+        <w:rPr>
+          <w:rFonts w:ascii="Arial" w:hAnsi="Arial" w:cs="Arial"/>
+          <w:sz w:val="29"/>
+          <w:sz-cs w:val="29"/>
+          <w:spacing w:val="0"/>
+          <w:color w:val="12181F"/>
+        </w:rPr>
+        <w:t xml:space="preserve"> </w:t>
+      </w:r>
+      <w:r>
+        <w:rPr>
+          <w:rFonts w:ascii="Arial" w:hAnsi="Arial" w:cs="Arial"/>
+          <w:sz w:val="26"/>
+          <w:sz-cs w:val="26"/>
+          <w:b/>
+          <w:spacing w:val="0"/>
+          <w:color w:val="0D322E"/>
+        </w:rPr>
         <w:t xml:space="preserve">Healthcare Automation Consultant</w:t>
       </w:r>
       <w:r>
@@ -5082,7 +5103,7 @@
           <w:spacing w:val="0"/>
           <w:color w:val="A76619"/>
         </w:rPr>
-        <w:t xml:space="preserve">CONSULTING CASE PATTERN</w:t>
+        <w:t xml:space="preserve">WHY ERIC</w:t>
       </w:r>
       <w:r>
         <w:rPr>
@@ -5107,169 +5128,6 @@
           <w:spacing w:val="0"/>
           <w:color w:val="0D322E"/>
         </w:rPr>
-        <w:t xml:space="preserve">HOW I TURN OPERATIONAL PAIN INTO DELIVERED AUTOMATION.</w:t>
-      </w:r>
-      <w:r>
-        <w:rPr>
-          <w:rFonts w:ascii="Arial" w:hAnsi="Arial" w:cs="Arial"/>
-          <w:sz w:val="29"/>
-          <w:sz-cs w:val="29"/>
-          <w:spacing w:val="0"/>
-          <w:color w:val="12181F"/>
-        </w:rPr>
-        <w:t xml:space="preserve"/>
-      </w:r>
-    </w:p>
-    <w:p>
-      <w:pPr/>
-      <w:r>
-        <w:rPr>
-          <w:rFonts w:ascii="Arial" w:hAnsi="Arial" w:cs="Arial"/>
-          <w:sz w:val="32"/>
-          <w:sz-cs w:val="32"/>
-          <w:b/>
-          <w:spacing w:val="0"/>
-          <w:color w:val="0D322E"/>
-        </w:rPr>
-        <w:t xml:space="preserve">1. Diagnose</w:t>
-      </w:r>
-      <w:r>
-        <w:rPr>
-          <w:rFonts w:ascii="Arial" w:hAnsi="Arial" w:cs="Arial"/>
-          <w:sz w:val="32"/>
-          <w:sz-cs w:val="32"/>
-          <w:b/>
-          <w:spacing w:val="0"/>
-          <w:color w:val="0D322E"/>
-        </w:rPr>
-        <w:t xml:space="preserve"/>
-      </w:r>
-    </w:p>
-    <w:p>
-      <w:pPr/>
-      <w:r>
-        <w:rPr>
-          <w:rFonts w:ascii="Arial" w:hAnsi="Arial" w:cs="Arial"/>
-          <w:sz w:val="29"/>
-          <w:sz-cs w:val="29"/>
-          <w:spacing w:val="0"/>
-          <w:color w:val="12181F"/>
-        </w:rPr>
-        <w:t xml:space="preserve">Run stakeholder discovery, inspect the work queue, identify repeatable manual effort, and isolate measurable automation opportunities.</w:t>
-      </w:r>
-    </w:p>
-    <w:p>
-      <w:pPr/>
-      <w:r>
-        <w:rPr>
-          <w:rFonts w:ascii="Arial" w:hAnsi="Arial" w:cs="Arial"/>
-          <w:sz w:val="32"/>
-          <w:sz-cs w:val="32"/>
-          <w:b/>
-          <w:spacing w:val="0"/>
-          <w:color w:val="0D322E"/>
-        </w:rPr>
-        <w:t xml:space="preserve">2. Build</w:t>
-      </w:r>
-      <w:r>
-        <w:rPr>
-          <w:rFonts w:ascii="Arial" w:hAnsi="Arial" w:cs="Arial"/>
-          <w:sz w:val="32"/>
-          <w:sz-cs w:val="32"/>
-          <w:b/>
-          <w:spacing w:val="0"/>
-          <w:color w:val="0D322E"/>
-        </w:rPr>
-        <w:t xml:space="preserve"/>
-      </w:r>
-    </w:p>
-    <w:p>
-      <w:pPr/>
-      <w:r>
-        <w:rPr>
-          <w:rFonts w:ascii="Arial" w:hAnsi="Arial" w:cs="Arial"/>
-          <w:sz w:val="29"/>
-          <w:sz-cs w:val="29"/>
-          <w:spacing w:val="0"/>
-          <w:color w:val="12181F"/>
-        </w:rPr>
-        <w:t xml:space="preserve">Design practical solutions using the right mix of UiPath, OCR, VBA/macros, SQL, Python, scripts, and workflow documentation.</w:t>
-      </w:r>
-    </w:p>
-    <w:p>
-      <w:pPr/>
-      <w:r>
-        <w:rPr>
-          <w:rFonts w:ascii="Arial" w:hAnsi="Arial" w:cs="Arial"/>
-          <w:sz w:val="32"/>
-          <w:sz-cs w:val="32"/>
-          <w:b/>
-          <w:spacing w:val="0"/>
-          <w:color w:val="0D322E"/>
-        </w:rPr>
-        <w:t xml:space="preserve">3. Enable</w:t>
-      </w:r>
-      <w:r>
-        <w:rPr>
-          <w:rFonts w:ascii="Arial" w:hAnsi="Arial" w:cs="Arial"/>
-          <w:sz w:val="32"/>
-          <w:sz-cs w:val="32"/>
-          <w:b/>
-          <w:spacing w:val="0"/>
-          <w:color w:val="0D322E"/>
-        </w:rPr>
-        <w:t xml:space="preserve"/>
-      </w:r>
-    </w:p>
-    <w:p>
-      <w:pPr/>
-      <w:r>
-        <w:rPr>
-          <w:rFonts w:ascii="Arial" w:hAnsi="Arial" w:cs="Arial"/>
-          <w:sz w:val="29"/>
-          <w:sz-cs w:val="29"/>
-          <w:spacing w:val="0"/>
-          <w:color w:val="12181F"/>
-        </w:rPr>
-        <w:t xml:space="preserve">Package the fix with documentation, training, support resources, and governance so teams can adopt and sustain the automation.</w:t>
-      </w:r>
-    </w:p>
-    <w:p>
-      <w:pPr/>
-      <w:r>
-        <w:rPr>
-          <w:rFonts w:ascii="Arial" w:hAnsi="Arial" w:cs="Arial"/>
-          <w:sz w:val="26"/>
-          <w:sz-cs w:val="26"/>
-          <w:b/>
-          <w:spacing w:val="0"/>
-          <w:color w:val="A76619"/>
-        </w:rPr>
-        <w:t xml:space="preserve">WHY ERIC</w:t>
-      </w:r>
-      <w:r>
-        <w:rPr>
-          <w:rFonts w:ascii="Arial" w:hAnsi="Arial" w:cs="Arial"/>
-          <w:sz w:val="26"/>
-          <w:sz-cs w:val="26"/>
-          <w:b/>
-          <w:spacing w:val="0"/>
-          <w:color w:val="A76619"/>
-        </w:rPr>
-        <w:t xml:space="preserve"/>
-      </w:r>
-    </w:p>
-    <w:p>
-      <w:pPr/>
-      <w:r>
-        <w:rPr>
-          <w:rFonts w:ascii="Arial" w:hAnsi="Arial" w:cs="Arial"/>
-          <w:sz w:val="50"/>
-          <w:sz-cs w:val="50"/>
-          <w:b/>
-          <w:spacing w:val="0"/>
-          <w:color w:val="0D322E"/>
-        </w:rPr>
         <w:t xml:space="preserve">A BUILDER WHO UNDERSTANDS OPERATIONS, NOT JUST TOOLS.</w:t>
       </w:r>
       <w:r>
@@ -5400,7 +5258,7 @@
           <w:spacing w:val="0"/>
           <w:color w:val="12181F"/>
         </w:rPr>
-        <w:t xml:space="preserve">Healthcare Context</w:t>
+        <w:t xml:space="preserve">Operations Context</w:t>
       </w:r>
       <w:r>
         <w:rPr>

</xml_diff>